<commit_message>
Tame reranker latency, vendor its model, fix future judgment dates
- Reranker: 16 candidates x 800 chars (was 40 x 1600) - measured ~120ms/pair,
  so the old pool added ~5s to every search; overhead now ~1s
- Dockerfile: vendor fastembed cross-encoder into the image with an offline
  load check - first production question no longer stalls ~60s downloading 88MB
- server: drop upstream future-dated judgment dates (ZimLII typos), fall back
  to neutral-citation year
- POTRAZ answers + solution spec: corrected corpus stats (7k instruments,
  5k judgments, 134k passages), live traction numbers, added reranker/citation
  verification/drafting
</commit_message>
<xml_diff>
--- a/onegov_ai_solution_specification.docx
+++ b/onegov_ai_solution_specification.docx
@@ -820,7 +820,7 @@
           <w:color w:val="000000"/>
           <w:sz w:val="20"/>
         </w:rPr>
-        <w:t>Solution objectives. OneGov AI unifies the Constitution, over 15,000 Acts, Statutory Instruments, General Notices and Government Gazettes, and more than 4,900 court judgments into a single platform where anyone can ask a legal question in plain language and receive an accurate answer with citations and links to the original official documents. The objectives are to provide free, plain-language, cited legal answers to every Zimbabwean with an internet connection, to maintain a continuously updated machine-readable corpus of national law from official public sources, and to serve professionals and institutions with advanced research tools and an integration API.</w:t>
+        <w:t>Solution objectives. OneGov AI unifies the Constitution, over 7,000 Acts, Statutory Instruments, General Notices and Government Gazettes, and more than 5,000 court judgments into a single platform where anyone can ask a legal question in plain language and receive an accurate answer with citations and links to the original official documents. The objectives are to provide free, plain-language, cited legal answers to every Zimbabwean with an internet connection, to maintain a continuously updated machine-readable corpus of national law from official public sources, and to serve professionals and institutions with advanced research tools and an integration API.</w:t>
       </w:r>
     </w:p>
     <w:p>
@@ -930,7 +930,7 @@
           <w:color w:val="000000"/>
           <w:sz w:val="20"/>
         </w:rPr>
-        <w:t>The primary segments are Zimbabwe's approximately 4,000 registered legal practitioners and their firms; corporate compliance, banking and insurance teams; NGOs and civic organisations; universities and law students; SMEs and entrepreneurs; and the general public. The value proposition differs by segment: citizens get free plain-language answers to legal questions that would otherwise require a paid consultation; professionals get research in seconds that currently takes hours across scattered sources; and institutions get structured legal intelligence through an API that no other Zimbabwean provider offers. As the first mover in AI-based Zimbabwean legal information, OneGov AI is creating this market segment, with more than 2,700 unique users reached organically in its first two months.</w:t>
+        <w:t>The primary segments are Zimbabwe's approximately 4,000 registered legal practitioners and their firms; corporate compliance, banking and insurance teams; NGOs and civic organisations; universities and law students; SMEs and entrepreneurs; and the general public. The value proposition differs by segment: citizens get free plain-language answers to legal questions that would otherwise require a paid consultation; professionals get research in seconds that currently takes hours across scattered sources; and institutions get structured legal intelligence through an API that no other Zimbabwean provider offers. As the first mover in AI-based Zimbabwean legal information, OneGov AI is creating this market segment, with more than 1,700 unique visitors reached organically every month.</w:t>
       </w:r>
     </w:p>
     <w:p>
@@ -1014,7 +1014,7 @@
           <w:color w:val="000000"/>
           <w:sz w:val="20"/>
         </w:rPr>
-        <w:t>The solution is a cloud-native service organised in four layers. The ingestion layer uses automated Python pipelines that collect new gazettes, statutory instruments and judgments weekly from official public sources, remove duplicates across sources, extract text from PDF documents and divide it into more than 154,000 semantically coherent passages. The retrieval layer is a hybrid engine that combines ChromaDB open-source vector search with BM25 keyword ranking and a knowledge graph of relationships between instruments such as amendments and citations. The reasoning layer is a large language model agent that plans searches, reads the retrieved law and composes plain-language answers constrained to cite only retrieved documents. The application layer is a FastAPI web application serving the chat interface, the case-law library, document downloads, accounts, payments and the developer API.</w:t>
+        <w:t>The solution is a cloud-native service organised in four layers. The ingestion layer uses automated Python pipelines that collect new gazettes, statutory instruments and judgments weekly from official public sources, remove duplicates across sources, extract text from PDF documents and divide it into more than 134,000 semantically coherent passages. The retrieval layer is a hybrid engine that combines ChromaDB open-source vector search with BM25 keyword ranking, a neural cross-encoder reranker that reads each candidate passage against the question, and a knowledge graph of relationships between instruments such as amendments and citations. The reasoning layer is a large language model agent that plans searches, reads the retrieved law and composes plain-language answers constrained to cite only retrieved documents, with every cited section automatically verified against the retrieved sources before the answer is delivered. The application layer is a FastAPI web application serving the chat interface, AI drafting of eleven legal document types, the case-law library, document downloads, accounts, payments and the developer API.</w:t>
       </w:r>
     </w:p>
     <w:p>
@@ -1178,7 +1178,7 @@
           <w:color w:val="000000"/>
           <w:sz w:val="20"/>
         </w:rPr>
-        <w:t>The platform was developed iteratively using an open-source stack, which allowed the full system to be built and taken to market in weeks rather than years. Development followed a pipeline approach: document collection was built for each official source, then extraction, de-duplication, chunking and indexing were automated into a single weekly refresh cycle that ends with an automated redeployment of the production container. Retrieval quality is tested continuously against known legal questions to confirm that the correct Acts, Statutory Instruments and judgments are surfaced, and answer accuracy is validated through built-in user feedback collection. The service is fully deployed in production at onegovai.app and has been serving the public since July 2026, with verified metrics of 2,713 unique visitors, 5,837 visits, 24 registered users including first paying subscribers, and more than 700 logged question and answer interactions. Deployment of new corpus updates or features takes minutes through the scripted build-and-release process.</w:t>
+        <w:t>The platform was developed iteratively using an open-source stack, which allowed the full system to be built and taken to market in weeks rather than years. Development followed a pipeline approach: document collection was built for each official source, then extraction, de-duplication, chunking and indexing were automated into a single weekly refresh cycle that ends with an automated redeployment of the production container. Retrieval quality is tested continuously against known legal questions to confirm that the correct Acts, Statutory Instruments and judgments are surfaced, and answer accuracy is validated through built-in user feedback collection. The service is fully deployed in production at onegovai.app and has been serving the public since July 2026, with verified metrics of 1,722 unique visitors and 3,369 visits in the past 30 days, 30 registered users including first paying Plus and Pro subscribers, and more than 1,000 logged question and answer interactions. Deployment of new corpus updates or features takes minutes through the scripted build-and-release process.</w:t>
       </w:r>
     </w:p>
     <w:p>
@@ -1262,7 +1262,7 @@
           <w:color w:val="000000"/>
           <w:sz w:val="20"/>
         </w:rPr>
-        <w:t>The team founded and registered Longacre Technologies (Private) Limited, the Zimbabwean technology company under which OneGov AI is developed and operated. OneGov AI is the company's flagship deployed product and is publicly verifiable at onegovai.app, including the live chat assistant, the case-law library of 4,928 judgments and the document download service. The underlying corpus pipeline, which collects, de-duplicates and indexes thousands of official documents weekly, is the team's prior engineering work that the platform builds upon.</w:t>
+        <w:t>The team founded and registered Longacre Technologies (Private) Limited, the Zimbabwean technology company under which OneGov AI is developed and operated. OneGov AI is the company's flagship deployed product and is publicly verifiable at onegovai.app, including the live chat assistant, the case-law library of 5,078 judgments and the document download service. The underlying corpus pipeline, which collects, de-duplicates and indexes thousands of official documents weekly, is the team's prior engineering work that the platform builds upon.</w:t>
       </w:r>
     </w:p>
     <w:p>

</xml_diff>